<commit_message>
-se continuo con el analisis de las metricas realizadas en el 1C 2026 en Programacion Concurrente
</commit_message>
<xml_diff>
--- a/metricas_realizadas/Prog-Concurrente/Analisis de metricas/Observaciones realizadas por los grupos.docx
+++ b/metricas_realizadas/Prog-Concurrente/Analisis de metricas/Observaciones realizadas por los grupos.docx
@@ -389,6 +389,31 @@
     </w:p>
     <w:p>
       <w:pPr>
+        <w:pStyle w:val="Prrafodelista"/>
+        <w:numPr>
+          <w:ilvl w:val="0"/>
+          <w:numId w:val="1"/>
+        </w:numPr>
+        <w:jc w:val="both"/>
+        <w:rPr>
+          <w:b/>
+          <w:bCs/>
+          <w:sz w:val="20"/>
+          <w:szCs w:val="20"/>
+        </w:rPr>
+      </w:pPr>
+      <w:r>
+        <w:rPr>
+          <w:b/>
+          <w:bCs/>
+          <w:sz w:val="20"/>
+          <w:szCs w:val="20"/>
+        </w:rPr>
+        <w:t>M5:</w:t>
+      </w:r>
+    </w:p>
+    <w:p>
+      <w:pPr>
         <w:ind w:left="708"/>
         <w:jc w:val="both"/>
         <w:rPr>
@@ -396,6 +421,125 @@
           <w:szCs w:val="20"/>
         </w:rPr>
       </w:pPr>
+      <w:r>
+        <w:rPr>
+          <w:sz w:val="20"/>
+          <w:szCs w:val="20"/>
+        </w:rPr>
+        <w:t xml:space="preserve">La implementación es conservadora pero correcta. El modelo de un único </w:t>
+      </w:r>
+      <w:proofErr w:type="spellStart"/>
+      <w:r>
+        <w:rPr>
+          <w:sz w:val="20"/>
+          <w:szCs w:val="20"/>
+        </w:rPr>
+        <w:t>game</w:t>
+      </w:r>
+      <w:proofErr w:type="spellEnd"/>
+      <w:r>
+        <w:rPr>
+          <w:sz w:val="20"/>
+          <w:szCs w:val="20"/>
+        </w:rPr>
+        <w:t xml:space="preserve">-loop </w:t>
+      </w:r>
+      <w:proofErr w:type="spellStart"/>
+      <w:r>
+        <w:rPr>
+          <w:sz w:val="20"/>
+          <w:szCs w:val="20"/>
+        </w:rPr>
+        <w:t>thread</w:t>
+      </w:r>
+      <w:proofErr w:type="spellEnd"/>
+      <w:r>
+        <w:rPr>
+          <w:sz w:val="20"/>
+          <w:szCs w:val="20"/>
+        </w:rPr>
+        <w:t xml:space="preserve"> evita la mayor parte de la complejidad concurrente, y las zonas verdaderamente </w:t>
+      </w:r>
+      <w:proofErr w:type="spellStart"/>
+      <w:r>
+        <w:rPr>
+          <w:sz w:val="20"/>
+          <w:szCs w:val="20"/>
+        </w:rPr>
+        <w:t>multi-thread</w:t>
+      </w:r>
+      <w:proofErr w:type="spellEnd"/>
+      <w:r>
+        <w:rPr>
+          <w:sz w:val="20"/>
+          <w:szCs w:val="20"/>
+        </w:rPr>
+        <w:t xml:space="preserve"> (audio, shutdown, tutorial) están sincronizadas con la primitiva adecuada: </w:t>
+      </w:r>
+      <w:proofErr w:type="spellStart"/>
+      <w:r>
+        <w:rPr>
+          <w:sz w:val="20"/>
+          <w:szCs w:val="20"/>
+        </w:rPr>
+        <w:t>synchronized</w:t>
+      </w:r>
+      <w:proofErr w:type="spellEnd"/>
+      <w:r>
+        <w:rPr>
+          <w:sz w:val="20"/>
+          <w:szCs w:val="20"/>
+        </w:rPr>
+        <w:t xml:space="preserve"> para invariantes compuestas, </w:t>
+      </w:r>
+      <w:proofErr w:type="spellStart"/>
+      <w:r>
+        <w:rPr>
+          <w:sz w:val="20"/>
+          <w:szCs w:val="20"/>
+        </w:rPr>
+        <w:t>volatile</w:t>
+      </w:r>
+      <w:proofErr w:type="spellEnd"/>
+      <w:r>
+        <w:rPr>
+          <w:sz w:val="20"/>
+          <w:szCs w:val="20"/>
+        </w:rPr>
+        <w:t xml:space="preserve"> para </w:t>
+      </w:r>
+      <w:proofErr w:type="spellStart"/>
+      <w:r>
+        <w:rPr>
+          <w:sz w:val="20"/>
+          <w:szCs w:val="20"/>
+        </w:rPr>
+        <w:t>flags</w:t>
+      </w:r>
+      <w:proofErr w:type="spellEnd"/>
+      <w:r>
+        <w:rPr>
+          <w:sz w:val="20"/>
+          <w:szCs w:val="20"/>
+        </w:rPr>
+        <w:t xml:space="preserve"> de visibilidad, </w:t>
+      </w:r>
+      <w:proofErr w:type="spellStart"/>
+      <w:r>
+        <w:rPr>
+          <w:sz w:val="20"/>
+          <w:szCs w:val="20"/>
+        </w:rPr>
+        <w:t>AtomicBoolean</w:t>
+      </w:r>
+      <w:proofErr w:type="spellEnd"/>
+      <w:r>
+        <w:rPr>
+          <w:sz w:val="20"/>
+          <w:szCs w:val="20"/>
+        </w:rPr>
+        <w:t xml:space="preserve"> para señalización sin sección crítica.</w:t>
+      </w:r>
     </w:p>
     <w:p>
       <w:pPr>
@@ -406,6 +550,1320 @@
           <w:szCs w:val="20"/>
         </w:rPr>
       </w:pPr>
+      <w:r>
+        <w:rPr>
+          <w:sz w:val="20"/>
+          <w:szCs w:val="20"/>
+        </w:rPr>
+        <w:t>Esto matiza la intuición de que los LLM producen código concurrente defectuoso: cuando el problema admite una solución conservadora, el modelo la implementa correctamente. El riesgo real aparece en la encapsulación (referencias expuestas, campos estáticos mutables) más que en los primitivos de sincronización</w:t>
+      </w:r>
+    </w:p>
+    <w:p>
+      <w:pPr>
+        <w:ind w:left="708"/>
+        <w:jc w:val="both"/>
+        <w:rPr>
+          <w:sz w:val="20"/>
+          <w:szCs w:val="20"/>
+        </w:rPr>
+      </w:pPr>
+      <w:r>
+        <w:rPr>
+          <w:sz w:val="20"/>
+          <w:szCs w:val="20"/>
+        </w:rPr>
+        <w:t xml:space="preserve">La debilidad principal no está en la concurrencia sino en la arquitectura: Game.java (MI=4.3) y GameRenderer.java (MI=4.8) en zona </w:t>
+      </w:r>
+      <w:proofErr w:type="spellStart"/>
+      <w:r>
+        <w:rPr>
+          <w:sz w:val="20"/>
+          <w:szCs w:val="20"/>
+        </w:rPr>
+        <w:t>inmantenible</w:t>
+      </w:r>
+      <w:proofErr w:type="spellEnd"/>
+      <w:r>
+        <w:rPr>
+          <w:sz w:val="20"/>
+          <w:szCs w:val="20"/>
+        </w:rPr>
+        <w:t xml:space="preserve"> por acumulación monolítica. Riel [6] y </w:t>
+      </w:r>
+      <w:proofErr w:type="spellStart"/>
+      <w:r>
+        <w:rPr>
+          <w:sz w:val="20"/>
+          <w:szCs w:val="20"/>
+        </w:rPr>
+        <w:t>Fowler</w:t>
+      </w:r>
+      <w:proofErr w:type="spellEnd"/>
+      <w:r>
+        <w:rPr>
+          <w:sz w:val="20"/>
+          <w:szCs w:val="20"/>
+        </w:rPr>
+        <w:t xml:space="preserve"> [5] son contundentes: la </w:t>
+      </w:r>
+      <w:proofErr w:type="spellStart"/>
+      <w:r>
+        <w:rPr>
+          <w:sz w:val="20"/>
+          <w:szCs w:val="20"/>
+        </w:rPr>
+        <w:t>God</w:t>
+      </w:r>
+      <w:proofErr w:type="spellEnd"/>
+      <w:r>
+        <w:rPr>
+          <w:sz w:val="20"/>
+          <w:szCs w:val="20"/>
+        </w:rPr>
+        <w:t xml:space="preserve"> </w:t>
+      </w:r>
+      <w:proofErr w:type="spellStart"/>
+      <w:r>
+        <w:rPr>
+          <w:sz w:val="20"/>
+          <w:szCs w:val="20"/>
+        </w:rPr>
+        <w:t>Class</w:t>
+      </w:r>
+      <w:proofErr w:type="spellEnd"/>
+      <w:r>
+        <w:rPr>
+          <w:sz w:val="20"/>
+          <w:szCs w:val="20"/>
+        </w:rPr>
+        <w:t xml:space="preserve"> viola el principio de responsabilidad única, dificulta los </w:t>
+      </w:r>
+      <w:proofErr w:type="spellStart"/>
+      <w:r>
+        <w:rPr>
+          <w:sz w:val="20"/>
+          <w:szCs w:val="20"/>
+        </w:rPr>
+        <w:t>tests</w:t>
+      </w:r>
+      <w:proofErr w:type="spellEnd"/>
+      <w:r>
+        <w:rPr>
+          <w:sz w:val="20"/>
+          <w:szCs w:val="20"/>
+        </w:rPr>
+        <w:t xml:space="preserve"> unitarios e incrementa el acoplamiento. El código generado por LLM tiende a maximizar </w:t>
+      </w:r>
+      <w:r>
+        <w:rPr>
+          <w:sz w:val="20"/>
+          <w:szCs w:val="20"/>
+        </w:rPr>
+        <w:lastRenderedPageBreak/>
+        <w:t>funcionalidad por respuesta a costa de modularidad, salvo que el prompt restrinja explícitamente la arquitectura</w:t>
+      </w:r>
+    </w:p>
+    <w:p>
+      <w:pPr>
+        <w:ind w:left="708"/>
+        <w:jc w:val="both"/>
+        <w:rPr>
+          <w:b/>
+          <w:bCs/>
+          <w:sz w:val="20"/>
+          <w:szCs w:val="20"/>
+        </w:rPr>
+      </w:pPr>
+      <w:r>
+        <w:rPr>
+          <w:b/>
+          <w:bCs/>
+          <w:sz w:val="20"/>
+          <w:szCs w:val="20"/>
+        </w:rPr>
+        <w:t>Ventajas y limitaciones del VibeCoding</w:t>
+      </w:r>
+    </w:p>
+    <w:p>
+      <w:pPr>
+        <w:ind w:left="708"/>
+        <w:jc w:val="both"/>
+        <w:rPr>
+          <w:b/>
+          <w:bCs/>
+          <w:sz w:val="20"/>
+          <w:szCs w:val="20"/>
+        </w:rPr>
+      </w:pPr>
+      <w:r>
+        <w:rPr>
+          <w:b/>
+          <w:bCs/>
+          <w:sz w:val="20"/>
+          <w:szCs w:val="20"/>
+        </w:rPr>
+        <w:t>Ventajas</w:t>
+      </w:r>
+    </w:p>
+    <w:p>
+      <w:pPr>
+        <w:pStyle w:val="Prrafodelista"/>
+        <w:numPr>
+          <w:ilvl w:val="0"/>
+          <w:numId w:val="5"/>
+        </w:numPr>
+        <w:jc w:val="both"/>
+        <w:rPr>
+          <w:sz w:val="20"/>
+          <w:szCs w:val="20"/>
+        </w:rPr>
+      </w:pPr>
+      <w:r>
+        <w:rPr>
+          <w:sz w:val="20"/>
+          <w:szCs w:val="20"/>
+        </w:rPr>
+        <w:t xml:space="preserve">Velocidad de entrega de un prototipo funcional con sincronización correcta, sin </w:t>
+      </w:r>
+      <w:proofErr w:type="spellStart"/>
+      <w:r>
+        <w:rPr>
+          <w:sz w:val="20"/>
+          <w:szCs w:val="20"/>
+        </w:rPr>
+        <w:t>expertise</w:t>
+      </w:r>
+      <w:proofErr w:type="spellEnd"/>
+      <w:r>
+        <w:rPr>
+          <w:sz w:val="20"/>
+          <w:szCs w:val="20"/>
+        </w:rPr>
+        <w:t xml:space="preserve"> profundo en el Java Memory Model.</w:t>
+      </w:r>
+    </w:p>
+    <w:p>
+      <w:pPr>
+        <w:pStyle w:val="Prrafodelista"/>
+        <w:numPr>
+          <w:ilvl w:val="0"/>
+          <w:numId w:val="5"/>
+        </w:numPr>
+        <w:jc w:val="both"/>
+        <w:rPr>
+          <w:sz w:val="20"/>
+          <w:szCs w:val="20"/>
+        </w:rPr>
+      </w:pPr>
+      <w:r>
+        <w:rPr>
+          <w:sz w:val="20"/>
+          <w:szCs w:val="20"/>
+        </w:rPr>
+        <w:t xml:space="preserve">Selección razonable de primitivas: </w:t>
+      </w:r>
+      <w:proofErr w:type="spellStart"/>
+      <w:r>
+        <w:rPr>
+          <w:sz w:val="20"/>
+          <w:szCs w:val="20"/>
+        </w:rPr>
+        <w:t>volatile</w:t>
+      </w:r>
+      <w:proofErr w:type="spellEnd"/>
+      <w:r>
+        <w:rPr>
+          <w:sz w:val="20"/>
+          <w:szCs w:val="20"/>
+        </w:rPr>
+        <w:t xml:space="preserve"> para </w:t>
+      </w:r>
+      <w:proofErr w:type="spellStart"/>
+      <w:r>
+        <w:rPr>
+          <w:sz w:val="20"/>
+          <w:szCs w:val="20"/>
+        </w:rPr>
+        <w:t>flags</w:t>
+      </w:r>
+      <w:proofErr w:type="spellEnd"/>
+      <w:r>
+        <w:rPr>
+          <w:sz w:val="20"/>
+          <w:szCs w:val="20"/>
+        </w:rPr>
+        <w:t xml:space="preserve">, </w:t>
+      </w:r>
+      <w:proofErr w:type="spellStart"/>
+      <w:r>
+        <w:rPr>
+          <w:sz w:val="20"/>
+          <w:szCs w:val="20"/>
+        </w:rPr>
+        <w:t>AtomicBoolean</w:t>
+      </w:r>
+      <w:proofErr w:type="spellEnd"/>
+      <w:r>
+        <w:rPr>
+          <w:sz w:val="20"/>
+          <w:szCs w:val="20"/>
+        </w:rPr>
+        <w:t xml:space="preserve"> para señalización, </w:t>
+      </w:r>
+      <w:proofErr w:type="spellStart"/>
+      <w:r>
+        <w:rPr>
+          <w:sz w:val="20"/>
+          <w:szCs w:val="20"/>
+        </w:rPr>
+        <w:t>synchronized</w:t>
+      </w:r>
+      <w:proofErr w:type="spellEnd"/>
+      <w:r>
+        <w:rPr>
+          <w:sz w:val="20"/>
+          <w:szCs w:val="20"/>
+        </w:rPr>
+        <w:t xml:space="preserve"> para invariantes compuestas.</w:t>
+      </w:r>
+    </w:p>
+    <w:p>
+      <w:pPr>
+        <w:pStyle w:val="Prrafodelista"/>
+        <w:numPr>
+          <w:ilvl w:val="0"/>
+          <w:numId w:val="5"/>
+        </w:numPr>
+        <w:jc w:val="both"/>
+        <w:rPr>
+          <w:sz w:val="20"/>
+          <w:szCs w:val="20"/>
+        </w:rPr>
+      </w:pPr>
+      <w:r>
+        <w:rPr>
+          <w:sz w:val="20"/>
+          <w:szCs w:val="20"/>
+        </w:rPr>
+        <w:t>Patrón de shutdown ordenado (</w:t>
+      </w:r>
+      <w:proofErr w:type="spellStart"/>
+      <w:r>
+        <w:rPr>
+          <w:sz w:val="20"/>
+          <w:szCs w:val="20"/>
+        </w:rPr>
+        <w:t>hook</w:t>
+      </w:r>
+      <w:proofErr w:type="spellEnd"/>
+      <w:r>
+        <w:rPr>
+          <w:sz w:val="20"/>
+          <w:szCs w:val="20"/>
+        </w:rPr>
+        <w:t xml:space="preserve"> + </w:t>
+      </w:r>
+      <w:proofErr w:type="spellStart"/>
+      <w:r>
+        <w:rPr>
+          <w:sz w:val="20"/>
+          <w:szCs w:val="20"/>
+        </w:rPr>
+        <w:t>join</w:t>
+      </w:r>
+      <w:proofErr w:type="spellEnd"/>
+      <w:r>
+        <w:rPr>
+          <w:sz w:val="20"/>
+          <w:szCs w:val="20"/>
+        </w:rPr>
+        <w:t xml:space="preserve"> con timeout) aplicado por defecto.</w:t>
+      </w:r>
+    </w:p>
+    <w:p>
+      <w:pPr>
+        <w:ind w:left="708"/>
+        <w:jc w:val="both"/>
+        <w:rPr>
+          <w:b/>
+          <w:bCs/>
+          <w:sz w:val="20"/>
+          <w:szCs w:val="20"/>
+        </w:rPr>
+      </w:pPr>
+      <w:r>
+        <w:rPr>
+          <w:b/>
+          <w:bCs/>
+          <w:sz w:val="20"/>
+          <w:szCs w:val="20"/>
+        </w:rPr>
+        <w:t>Limitaciones</w:t>
+      </w:r>
+    </w:p>
+    <w:p>
+      <w:pPr>
+        <w:pStyle w:val="Prrafodelista"/>
+        <w:numPr>
+          <w:ilvl w:val="0"/>
+          <w:numId w:val="5"/>
+        </w:numPr>
+        <w:jc w:val="both"/>
+        <w:rPr>
+          <w:sz w:val="20"/>
+          <w:szCs w:val="20"/>
+        </w:rPr>
+      </w:pPr>
+      <w:r>
+        <w:rPr>
+          <w:sz w:val="20"/>
+          <w:szCs w:val="20"/>
+        </w:rPr>
+        <w:t xml:space="preserve">Sesgo monolítico: tendencia a </w:t>
+      </w:r>
+      <w:proofErr w:type="spellStart"/>
+      <w:r>
+        <w:rPr>
+          <w:sz w:val="20"/>
+          <w:szCs w:val="20"/>
+        </w:rPr>
+        <w:t>God</w:t>
+      </w:r>
+      <w:proofErr w:type="spellEnd"/>
+      <w:r>
+        <w:rPr>
+          <w:sz w:val="20"/>
+          <w:szCs w:val="20"/>
+        </w:rPr>
+        <w:t xml:space="preserve"> </w:t>
+      </w:r>
+      <w:proofErr w:type="spellStart"/>
+      <w:r>
+        <w:rPr>
+          <w:sz w:val="20"/>
+          <w:szCs w:val="20"/>
+        </w:rPr>
+        <w:t>Class</w:t>
+      </w:r>
+      <w:proofErr w:type="spellEnd"/>
+      <w:r>
+        <w:rPr>
+          <w:sz w:val="20"/>
+          <w:szCs w:val="20"/>
+        </w:rPr>
+        <w:t xml:space="preserve"> si el prompt no especifica arquitectura de paquetes.</w:t>
+      </w:r>
+    </w:p>
+    <w:p>
+      <w:pPr>
+        <w:pStyle w:val="Prrafodelista"/>
+        <w:numPr>
+          <w:ilvl w:val="0"/>
+          <w:numId w:val="5"/>
+        </w:numPr>
+        <w:jc w:val="both"/>
+        <w:rPr>
+          <w:sz w:val="20"/>
+          <w:szCs w:val="20"/>
+        </w:rPr>
+      </w:pPr>
+      <w:r>
+        <w:rPr>
+          <w:sz w:val="20"/>
+          <w:szCs w:val="20"/>
+        </w:rPr>
+        <w:t>Sesgo de plataforma: defectos silenciosos al portar entre sistemas operativos (bug del cursor en macOS).</w:t>
+      </w:r>
+    </w:p>
+    <w:p>
+      <w:pPr>
+        <w:pStyle w:val="Prrafodelista"/>
+        <w:numPr>
+          <w:ilvl w:val="0"/>
+          <w:numId w:val="5"/>
+        </w:numPr>
+        <w:jc w:val="both"/>
+        <w:rPr>
+          <w:sz w:val="20"/>
+          <w:szCs w:val="20"/>
+        </w:rPr>
+      </w:pPr>
+      <w:r>
+        <w:rPr>
+          <w:sz w:val="20"/>
+          <w:szCs w:val="20"/>
+        </w:rPr>
+        <w:t>Subutilización del paralelismo: el modelo eligió la solución conservadora sin explorar paralelización de IA de enemigos o render asíncrono.</w:t>
+      </w:r>
+    </w:p>
+    <w:p>
+      <w:pPr>
+        <w:pStyle w:val="Prrafodelista"/>
+        <w:numPr>
+          <w:ilvl w:val="0"/>
+          <w:numId w:val="5"/>
+        </w:numPr>
+        <w:jc w:val="both"/>
+        <w:rPr>
+          <w:sz w:val="20"/>
+          <w:szCs w:val="20"/>
+        </w:rPr>
+      </w:pPr>
+      <w:r>
+        <w:rPr>
+          <w:sz w:val="20"/>
+          <w:szCs w:val="20"/>
+        </w:rPr>
+        <w:t xml:space="preserve">Falta de trazabilidad nativa de tokens y refinamientos en el flujo de Claude </w:t>
+      </w:r>
+      <w:proofErr w:type="spellStart"/>
+      <w:r>
+        <w:rPr>
+          <w:sz w:val="20"/>
+          <w:szCs w:val="20"/>
+        </w:rPr>
+        <w:t>Code</w:t>
+      </w:r>
+      <w:proofErr w:type="spellEnd"/>
+      <w:r>
+        <w:rPr>
+          <w:sz w:val="20"/>
+          <w:szCs w:val="20"/>
+        </w:rPr>
+        <w:t>.</w:t>
+      </w:r>
+    </w:p>
+    <w:p>
+      <w:pPr>
+        <w:jc w:val="both"/>
+        <w:rPr>
+          <w:sz w:val="20"/>
+          <w:szCs w:val="20"/>
+        </w:rPr>
+      </w:pPr>
+    </w:p>
+    <w:p>
+      <w:pPr>
+        <w:pStyle w:val="Prrafodelista"/>
+        <w:numPr>
+          <w:ilvl w:val="0"/>
+          <w:numId w:val="1"/>
+        </w:numPr>
+        <w:jc w:val="both"/>
+        <w:rPr>
+          <w:b/>
+          <w:bCs/>
+          <w:sz w:val="20"/>
+          <w:szCs w:val="20"/>
+        </w:rPr>
+      </w:pPr>
+      <w:r>
+        <w:rPr>
+          <w:b/>
+          <w:bCs/>
+          <w:sz w:val="20"/>
+          <w:szCs w:val="20"/>
+        </w:rPr>
+        <w:t>M6</w:t>
+      </w:r>
+    </w:p>
+    <w:p>
+      <w:pPr>
+        <w:ind w:left="708"/>
+        <w:jc w:val="both"/>
+        <w:rPr>
+          <w:sz w:val="20"/>
+          <w:szCs w:val="20"/>
+        </w:rPr>
+      </w:pPr>
+      <w:r>
+        <w:rPr>
+          <w:sz w:val="20"/>
+          <w:szCs w:val="20"/>
+        </w:rPr>
+        <w:t>El c</w:t>
+      </w:r>
+      <w:r>
+        <w:rPr>
+          <w:rFonts w:hint="cs"/>
+          <w:sz w:val="20"/>
+          <w:szCs w:val="20"/>
+        </w:rPr>
+        <w:t>ó</w:t>
+      </w:r>
+      <w:r>
+        <w:rPr>
+          <w:sz w:val="20"/>
+          <w:szCs w:val="20"/>
+        </w:rPr>
+        <w:t>digo generado cumple todos los requisitos funcionales del prompt, implementa con propiedad el patr</w:t>
+      </w:r>
+      <w:r>
+        <w:rPr>
+          <w:rFonts w:hint="cs"/>
+          <w:sz w:val="20"/>
+          <w:szCs w:val="20"/>
+        </w:rPr>
+        <w:t>ó</w:t>
+      </w:r>
+      <w:r>
+        <w:rPr>
+          <w:sz w:val="20"/>
+          <w:szCs w:val="20"/>
+        </w:rPr>
+        <w:t xml:space="preserve">n productor-consumidor, usa los mecanismos de concurrencia adecuados (colas </w:t>
+      </w:r>
+      <w:proofErr w:type="spellStart"/>
+      <w:r>
+        <w:rPr>
+          <w:sz w:val="20"/>
+          <w:szCs w:val="20"/>
+        </w:rPr>
+        <w:t>thread-safe</w:t>
+      </w:r>
+      <w:proofErr w:type="spellEnd"/>
+      <w:r>
+        <w:rPr>
+          <w:sz w:val="20"/>
+          <w:szCs w:val="20"/>
+        </w:rPr>
+        <w:t xml:space="preserve">, </w:t>
+      </w:r>
+      <w:proofErr w:type="spellStart"/>
+      <w:r>
+        <w:rPr>
+          <w:sz w:val="20"/>
+          <w:szCs w:val="20"/>
+        </w:rPr>
+        <w:t>Lock</w:t>
+      </w:r>
+      <w:proofErr w:type="spellEnd"/>
+      <w:r>
+        <w:rPr>
+          <w:sz w:val="20"/>
+          <w:szCs w:val="20"/>
+        </w:rPr>
+        <w:t xml:space="preserve">, </w:t>
+      </w:r>
+      <w:proofErr w:type="spellStart"/>
+      <w:r>
+        <w:rPr>
+          <w:sz w:val="20"/>
+          <w:szCs w:val="20"/>
+        </w:rPr>
+        <w:t>sentinelas</w:t>
+      </w:r>
+      <w:proofErr w:type="spellEnd"/>
+      <w:r>
+        <w:rPr>
+          <w:sz w:val="20"/>
+          <w:szCs w:val="20"/>
+        </w:rPr>
+        <w:t xml:space="preserve">) y es concurrentemente correcto en el camino feliz </w:t>
+      </w:r>
+      <w:r>
+        <w:rPr>
+          <w:rFonts w:hint="cs"/>
+          <w:sz w:val="20"/>
+          <w:szCs w:val="20"/>
+        </w:rPr>
+        <w:t>—</w:t>
+      </w:r>
+      <w:r>
+        <w:rPr>
+          <w:sz w:val="20"/>
+          <w:szCs w:val="20"/>
+        </w:rPr>
+        <w:t xml:space="preserve"> sin </w:t>
+      </w:r>
+      <w:proofErr w:type="spellStart"/>
+      <w:r>
+        <w:rPr>
+          <w:sz w:val="20"/>
+          <w:szCs w:val="20"/>
+        </w:rPr>
+        <w:t>race</w:t>
+      </w:r>
+      <w:proofErr w:type="spellEnd"/>
+      <w:r>
+        <w:rPr>
+          <w:sz w:val="20"/>
+          <w:szCs w:val="20"/>
+        </w:rPr>
+        <w:t xml:space="preserve"> </w:t>
+      </w:r>
+      <w:proofErr w:type="spellStart"/>
+      <w:r>
+        <w:rPr>
+          <w:sz w:val="20"/>
+          <w:szCs w:val="20"/>
+        </w:rPr>
+        <w:t>conditions</w:t>
+      </w:r>
+      <w:proofErr w:type="spellEnd"/>
+      <w:r>
+        <w:rPr>
+          <w:sz w:val="20"/>
+          <w:szCs w:val="20"/>
+        </w:rPr>
+        <w:t xml:space="preserve">, sin </w:t>
+      </w:r>
+      <w:proofErr w:type="spellStart"/>
+      <w:r>
+        <w:rPr>
+          <w:sz w:val="20"/>
+          <w:szCs w:val="20"/>
+        </w:rPr>
+        <w:t>deadlock</w:t>
+      </w:r>
+      <w:proofErr w:type="spellEnd"/>
+      <w:r>
+        <w:rPr>
+          <w:sz w:val="20"/>
+          <w:szCs w:val="20"/>
+        </w:rPr>
+        <w:t xml:space="preserve"> y con exclusi</w:t>
+      </w:r>
+      <w:r>
+        <w:rPr>
+          <w:rFonts w:hint="cs"/>
+          <w:sz w:val="20"/>
+          <w:szCs w:val="20"/>
+        </w:rPr>
+        <w:t>ó</w:t>
+      </w:r>
+      <w:r>
+        <w:rPr>
+          <w:sz w:val="20"/>
+          <w:szCs w:val="20"/>
+        </w:rPr>
+        <w:t>n mutua sobre el estado compartido.</w:t>
+      </w:r>
+    </w:p>
+    <w:p>
+      <w:pPr>
+        <w:ind w:left="708"/>
+        <w:jc w:val="both"/>
+        <w:rPr>
+          <w:sz w:val="20"/>
+          <w:szCs w:val="20"/>
+        </w:rPr>
+      </w:pPr>
+      <w:r>
+        <w:rPr>
+          <w:sz w:val="20"/>
+          <w:szCs w:val="20"/>
+        </w:rPr>
+        <w:t>Las ventajas que pudimos encontrar son las siguientes:</w:t>
+      </w:r>
+    </w:p>
+    <w:p>
+      <w:pPr>
+        <w:pStyle w:val="Prrafodelista"/>
+        <w:numPr>
+          <w:ilvl w:val="0"/>
+          <w:numId w:val="8"/>
+        </w:numPr>
+        <w:jc w:val="both"/>
+        <w:rPr>
+          <w:sz w:val="20"/>
+          <w:szCs w:val="20"/>
+        </w:rPr>
+      </w:pPr>
+      <w:r>
+        <w:rPr>
+          <w:sz w:val="20"/>
+          <w:szCs w:val="20"/>
+        </w:rPr>
+        <w:t>Velocidad de generaci</w:t>
+      </w:r>
+      <w:r>
+        <w:rPr>
+          <w:rFonts w:hint="cs"/>
+          <w:sz w:val="20"/>
+          <w:szCs w:val="20"/>
+        </w:rPr>
+        <w:t>ó</w:t>
+      </w:r>
+      <w:r>
+        <w:rPr>
+          <w:sz w:val="20"/>
+          <w:szCs w:val="20"/>
+        </w:rPr>
+        <w:t>n de c</w:t>
+      </w:r>
+      <w:r>
+        <w:rPr>
+          <w:rFonts w:hint="cs"/>
+          <w:sz w:val="20"/>
+          <w:szCs w:val="20"/>
+        </w:rPr>
+        <w:t>ó</w:t>
+      </w:r>
+      <w:r>
+        <w:rPr>
+          <w:sz w:val="20"/>
+          <w:szCs w:val="20"/>
+        </w:rPr>
+        <w:t>digo con respecto a lo que har</w:t>
+      </w:r>
+      <w:r>
+        <w:rPr>
+          <w:rFonts w:hint="cs"/>
+          <w:sz w:val="20"/>
+          <w:szCs w:val="20"/>
+        </w:rPr>
+        <w:t>í</w:t>
+      </w:r>
+      <w:r>
+        <w:rPr>
+          <w:sz w:val="20"/>
+          <w:szCs w:val="20"/>
+        </w:rPr>
+        <w:t xml:space="preserve">a un </w:t>
+      </w:r>
+      <w:proofErr w:type="spellStart"/>
+      <w:r>
+        <w:rPr>
+          <w:sz w:val="20"/>
+          <w:szCs w:val="20"/>
+        </w:rPr>
+        <w:t>dev</w:t>
+      </w:r>
+      <w:proofErr w:type="spellEnd"/>
+      <w:r>
+        <w:rPr>
+          <w:sz w:val="20"/>
+          <w:szCs w:val="20"/>
+        </w:rPr>
+        <w:t>.</w:t>
+      </w:r>
+    </w:p>
+    <w:p>
+      <w:pPr>
+        <w:pStyle w:val="Prrafodelista"/>
+        <w:numPr>
+          <w:ilvl w:val="0"/>
+          <w:numId w:val="8"/>
+        </w:numPr>
+        <w:jc w:val="both"/>
+        <w:rPr>
+          <w:sz w:val="20"/>
+          <w:szCs w:val="20"/>
+        </w:rPr>
+      </w:pPr>
+      <w:r>
+        <w:rPr>
+          <w:sz w:val="20"/>
+          <w:szCs w:val="20"/>
+        </w:rPr>
+        <w:t>Cumple con los requisitos funcionales que se le pide en el prompt</w:t>
+      </w:r>
+    </w:p>
+    <w:p>
+      <w:pPr>
+        <w:pStyle w:val="Prrafodelista"/>
+        <w:numPr>
+          <w:ilvl w:val="0"/>
+          <w:numId w:val="8"/>
+        </w:numPr>
+        <w:jc w:val="both"/>
+        <w:rPr>
+          <w:sz w:val="20"/>
+          <w:szCs w:val="20"/>
+        </w:rPr>
+      </w:pPr>
+      <w:r>
+        <w:rPr>
+          <w:sz w:val="20"/>
+          <w:szCs w:val="20"/>
+        </w:rPr>
+        <w:t>C</w:t>
+      </w:r>
+      <w:r>
+        <w:rPr>
+          <w:rFonts w:hint="cs"/>
+          <w:sz w:val="20"/>
+          <w:szCs w:val="20"/>
+        </w:rPr>
+        <w:t>ó</w:t>
+      </w:r>
+      <w:r>
+        <w:rPr>
+          <w:sz w:val="20"/>
+          <w:szCs w:val="20"/>
+        </w:rPr>
+        <w:t>digo funcional y con instructivo para poder realizar pruebas.</w:t>
+      </w:r>
+    </w:p>
+    <w:p>
+      <w:pPr>
+        <w:pStyle w:val="Prrafodelista"/>
+        <w:numPr>
+          <w:ilvl w:val="0"/>
+          <w:numId w:val="8"/>
+        </w:numPr>
+        <w:jc w:val="both"/>
+        <w:rPr>
+          <w:sz w:val="20"/>
+          <w:szCs w:val="20"/>
+        </w:rPr>
+      </w:pPr>
+      <w:r>
+        <w:rPr>
+          <w:sz w:val="20"/>
+          <w:szCs w:val="20"/>
+        </w:rPr>
+        <w:t>T</w:t>
+      </w:r>
+      <w:r>
+        <w:rPr>
+          <w:sz w:val="20"/>
+          <w:szCs w:val="20"/>
+        </w:rPr>
+        <w:t>razabilidad de los archivos creados.</w:t>
+      </w:r>
+    </w:p>
+    <w:p>
+      <w:pPr>
+        <w:ind w:left="708"/>
+        <w:jc w:val="both"/>
+        <w:rPr>
+          <w:sz w:val="20"/>
+          <w:szCs w:val="20"/>
+        </w:rPr>
+      </w:pPr>
+      <w:r>
+        <w:rPr>
+          <w:rFonts w:hint="cs"/>
+          <w:sz w:val="20"/>
+          <w:szCs w:val="20"/>
+        </w:rPr>
+        <w:t>•</w:t>
+      </w:r>
+      <w:r>
+        <w:rPr>
+          <w:sz w:val="20"/>
+          <w:szCs w:val="20"/>
+        </w:rPr>
+        <w:t>Explicaci</w:t>
+      </w:r>
+      <w:r>
+        <w:rPr>
+          <w:rFonts w:hint="cs"/>
+          <w:sz w:val="20"/>
+          <w:szCs w:val="20"/>
+        </w:rPr>
+        <w:t>ó</w:t>
+      </w:r>
+      <w:r>
+        <w:rPr>
+          <w:sz w:val="20"/>
+          <w:szCs w:val="20"/>
+        </w:rPr>
+        <w:t>n detallada de la utilidad de cada funci</w:t>
+      </w:r>
+      <w:r>
+        <w:rPr>
+          <w:rFonts w:hint="cs"/>
+          <w:sz w:val="20"/>
+          <w:szCs w:val="20"/>
+        </w:rPr>
+        <w:t>ó</w:t>
+      </w:r>
+      <w:r>
+        <w:rPr>
+          <w:sz w:val="20"/>
+          <w:szCs w:val="20"/>
+        </w:rPr>
+        <w:t>n y clase creada, y los criterios utilizados.</w:t>
+      </w:r>
+    </w:p>
+    <w:p>
+      <w:pPr>
+        <w:ind w:left="708"/>
+        <w:jc w:val="both"/>
+        <w:rPr>
+          <w:sz w:val="20"/>
+          <w:szCs w:val="20"/>
+        </w:rPr>
+      </w:pPr>
+      <w:r>
+        <w:rPr>
+          <w:sz w:val="20"/>
+          <w:szCs w:val="20"/>
+        </w:rPr>
+        <w:t>Sin embargo, se encontraron algunas limitaciones y fallas:</w:t>
+      </w:r>
+    </w:p>
+    <w:p>
+      <w:pPr>
+        <w:pStyle w:val="Prrafodelista"/>
+        <w:numPr>
+          <w:ilvl w:val="0"/>
+          <w:numId w:val="7"/>
+        </w:numPr>
+        <w:jc w:val="both"/>
+        <w:rPr>
+          <w:sz w:val="20"/>
+          <w:szCs w:val="20"/>
+        </w:rPr>
+      </w:pPr>
+      <w:r>
+        <w:rPr>
+          <w:sz w:val="20"/>
+          <w:szCs w:val="20"/>
+        </w:rPr>
+        <w:t>Cuelgue ante error: el agregador no-</w:t>
+      </w:r>
+      <w:proofErr w:type="spellStart"/>
+      <w:r>
+        <w:rPr>
+          <w:sz w:val="20"/>
+          <w:szCs w:val="20"/>
+        </w:rPr>
+        <w:t>daemon</w:t>
+      </w:r>
+      <w:proofErr w:type="spellEnd"/>
+      <w:r>
+        <w:rPr>
+          <w:sz w:val="20"/>
+          <w:szCs w:val="20"/>
+        </w:rPr>
+        <w:t xml:space="preserve">, sin </w:t>
+      </w:r>
+      <w:proofErr w:type="spellStart"/>
+      <w:r>
+        <w:rPr>
+          <w:sz w:val="20"/>
+          <w:szCs w:val="20"/>
+        </w:rPr>
+        <w:t>sentinela</w:t>
+      </w:r>
+      <w:proofErr w:type="spellEnd"/>
+      <w:r>
+        <w:rPr>
+          <w:sz w:val="20"/>
+          <w:szCs w:val="20"/>
+        </w:rPr>
+        <w:t xml:space="preserve"> garantizado por try/</w:t>
+      </w:r>
+      <w:proofErr w:type="spellStart"/>
+      <w:r>
+        <w:rPr>
+          <w:sz w:val="20"/>
+          <w:szCs w:val="20"/>
+        </w:rPr>
+        <w:t>finally</w:t>
+      </w:r>
+      <w:proofErr w:type="spellEnd"/>
+      <w:r>
+        <w:rPr>
+          <w:sz w:val="20"/>
+          <w:szCs w:val="20"/>
+        </w:rPr>
+        <w:t>, viola el requisito expl</w:t>
+      </w:r>
+      <w:r>
+        <w:rPr>
+          <w:rFonts w:hint="cs"/>
+          <w:sz w:val="20"/>
+          <w:szCs w:val="20"/>
+        </w:rPr>
+        <w:t>í</w:t>
+      </w:r>
+      <w:r>
+        <w:rPr>
+          <w:sz w:val="20"/>
+          <w:szCs w:val="20"/>
+        </w:rPr>
+        <w:t>cito de "finalizar sin colgarse" (Verificado con --</w:t>
+      </w:r>
+      <w:proofErr w:type="spellStart"/>
+      <w:r>
+        <w:rPr>
+          <w:sz w:val="20"/>
+          <w:szCs w:val="20"/>
+        </w:rPr>
+        <w:t>workers</w:t>
+      </w:r>
+      <w:proofErr w:type="spellEnd"/>
+      <w:r>
+        <w:rPr>
+          <w:sz w:val="20"/>
+          <w:szCs w:val="20"/>
+        </w:rPr>
+        <w:t xml:space="preserve"> 0).</w:t>
+      </w:r>
+    </w:p>
+    <w:p>
+      <w:pPr>
+        <w:pStyle w:val="Prrafodelista"/>
+        <w:numPr>
+          <w:ilvl w:val="0"/>
+          <w:numId w:val="7"/>
+        </w:numPr>
+        <w:jc w:val="both"/>
+        <w:rPr>
+          <w:sz w:val="20"/>
+          <w:szCs w:val="20"/>
+        </w:rPr>
+      </w:pPr>
+      <w:r>
+        <w:rPr>
+          <w:sz w:val="20"/>
+          <w:szCs w:val="20"/>
+        </w:rPr>
+        <w:t>Garant</w:t>
+      </w:r>
+      <w:r>
+        <w:rPr>
+          <w:rFonts w:hint="cs"/>
+          <w:sz w:val="20"/>
+          <w:szCs w:val="20"/>
+        </w:rPr>
+        <w:t>í</w:t>
+      </w:r>
+      <w:r>
+        <w:rPr>
+          <w:sz w:val="20"/>
+          <w:szCs w:val="20"/>
+        </w:rPr>
+        <w:t>as de concurrencia evadibles: -</w:t>
+      </w:r>
+      <w:proofErr w:type="spellStart"/>
+      <w:r>
+        <w:rPr>
+          <w:sz w:val="20"/>
+          <w:szCs w:val="20"/>
+        </w:rPr>
+        <w:t>queue-size</w:t>
+      </w:r>
+      <w:proofErr w:type="spellEnd"/>
+      <w:r>
+        <w:rPr>
+          <w:sz w:val="20"/>
+          <w:szCs w:val="20"/>
+        </w:rPr>
+        <w:t xml:space="preserve"> 0 desactiva la cola acotada; los argumentos num</w:t>
+      </w:r>
+      <w:r>
+        <w:rPr>
+          <w:rFonts w:hint="cs"/>
+          <w:sz w:val="20"/>
+          <w:szCs w:val="20"/>
+        </w:rPr>
+        <w:t>é</w:t>
+      </w:r>
+      <w:r>
+        <w:rPr>
+          <w:sz w:val="20"/>
+          <w:szCs w:val="20"/>
+        </w:rPr>
+        <w:t>ricos no se validan.</w:t>
+      </w:r>
+    </w:p>
+    <w:p>
+      <w:pPr>
+        <w:pStyle w:val="Prrafodelista"/>
+        <w:numPr>
+          <w:ilvl w:val="0"/>
+          <w:numId w:val="7"/>
+        </w:numPr>
+        <w:jc w:val="both"/>
+        <w:rPr>
+          <w:sz w:val="20"/>
+          <w:szCs w:val="20"/>
+        </w:rPr>
+      </w:pPr>
+      <w:r>
+        <w:rPr>
+          <w:sz w:val="20"/>
+          <w:szCs w:val="20"/>
+        </w:rPr>
+        <w:t xml:space="preserve">Errores invisibles: las excepciones de los </w:t>
+      </w:r>
+      <w:proofErr w:type="spellStart"/>
+      <w:r>
+        <w:rPr>
+          <w:sz w:val="20"/>
+          <w:szCs w:val="20"/>
+        </w:rPr>
+        <w:t>workers</w:t>
+      </w:r>
+      <w:proofErr w:type="spellEnd"/>
+      <w:r>
+        <w:rPr>
+          <w:sz w:val="20"/>
+          <w:szCs w:val="20"/>
+        </w:rPr>
+        <w:t xml:space="preserve"> se pierden sin traza y provocan p</w:t>
+      </w:r>
+      <w:r>
+        <w:rPr>
+          <w:rFonts w:hint="cs"/>
+          <w:sz w:val="20"/>
+          <w:szCs w:val="20"/>
+        </w:rPr>
+        <w:t>é</w:t>
+      </w:r>
+      <w:r>
+        <w:rPr>
+          <w:sz w:val="20"/>
+          <w:szCs w:val="20"/>
+        </w:rPr>
+        <w:t>rdida silenciosa de datos.</w:t>
+      </w:r>
+    </w:p>
+    <w:p>
+      <w:pPr>
+        <w:ind w:left="708"/>
+        <w:jc w:val="both"/>
+        <w:rPr>
+          <w:sz w:val="20"/>
+          <w:szCs w:val="20"/>
+        </w:rPr>
+      </w:pPr>
+      <w:r>
+        <w:rPr>
+          <w:sz w:val="20"/>
+          <w:szCs w:val="20"/>
+        </w:rPr>
+        <w:t>Esto se debe a que, por un lado, al darle la potestad a la IA de generar el c</w:t>
+      </w:r>
+      <w:r>
+        <w:rPr>
+          <w:rFonts w:hint="cs"/>
+          <w:sz w:val="20"/>
+          <w:szCs w:val="20"/>
+        </w:rPr>
+        <w:t>ó</w:t>
+      </w:r>
+      <w:r>
+        <w:rPr>
+          <w:sz w:val="20"/>
+          <w:szCs w:val="20"/>
+        </w:rPr>
+        <w:t xml:space="preserve">digo completo, queriendo cumplir con los requisitos funcionales, en el camino va </w:t>
+      </w:r>
+      <w:r>
+        <w:rPr>
+          <w:rFonts w:hint="cs"/>
+          <w:sz w:val="20"/>
+          <w:szCs w:val="20"/>
+        </w:rPr>
+        <w:t>“</w:t>
+      </w:r>
+      <w:r>
+        <w:rPr>
+          <w:sz w:val="20"/>
+          <w:szCs w:val="20"/>
+        </w:rPr>
+        <w:t>asumiendo</w:t>
+      </w:r>
+      <w:r>
+        <w:rPr>
+          <w:rFonts w:hint="cs"/>
+          <w:sz w:val="20"/>
+          <w:szCs w:val="20"/>
+        </w:rPr>
+        <w:t>”</w:t>
+      </w:r>
+      <w:r>
+        <w:rPr>
+          <w:sz w:val="20"/>
+          <w:szCs w:val="20"/>
+        </w:rPr>
+        <w:t xml:space="preserve"> cosas para poder llegar al objetivo. En algunas sentencias no se realizan validaciones que pueden ser cr</w:t>
+      </w:r>
+      <w:r>
+        <w:rPr>
+          <w:rFonts w:hint="cs"/>
+          <w:sz w:val="20"/>
+          <w:szCs w:val="20"/>
+        </w:rPr>
+        <w:t>í</w:t>
+      </w:r>
+      <w:r>
+        <w:rPr>
+          <w:sz w:val="20"/>
+          <w:szCs w:val="20"/>
+        </w:rPr>
+        <w:t xml:space="preserve">ticas para el proyecto (por ejemplo, para ingresar la ruta del argumento </w:t>
+      </w:r>
+      <w:r>
+        <w:rPr>
+          <w:rFonts w:hint="cs"/>
+          <w:sz w:val="20"/>
+          <w:szCs w:val="20"/>
+        </w:rPr>
+        <w:t>“</w:t>
+      </w:r>
+      <w:r>
+        <w:rPr>
+          <w:sz w:val="20"/>
+          <w:szCs w:val="20"/>
+        </w:rPr>
+        <w:t>--input-</w:t>
+      </w:r>
+      <w:proofErr w:type="spellStart"/>
+      <w:r>
+        <w:rPr>
+          <w:sz w:val="20"/>
+          <w:szCs w:val="20"/>
+        </w:rPr>
+        <w:t>dir</w:t>
+      </w:r>
+      <w:proofErr w:type="spellEnd"/>
+      <w:r>
+        <w:rPr>
+          <w:sz w:val="20"/>
+          <w:szCs w:val="20"/>
+        </w:rPr>
+        <w:t>", no se valida la existencia del mismo).</w:t>
+      </w:r>
+    </w:p>
+    <w:p>
+      <w:pPr>
+        <w:ind w:left="708"/>
+        <w:jc w:val="both"/>
+        <w:rPr>
+          <w:sz w:val="20"/>
+          <w:szCs w:val="20"/>
+        </w:rPr>
+      </w:pPr>
+      <w:proofErr w:type="spellStart"/>
+      <w:r>
+        <w:rPr>
+          <w:sz w:val="20"/>
+          <w:szCs w:val="20"/>
+        </w:rPr>
+        <w:lastRenderedPageBreak/>
+        <w:t>Tambien</w:t>
+      </w:r>
+      <w:proofErr w:type="spellEnd"/>
+      <w:r>
+        <w:rPr>
+          <w:sz w:val="20"/>
+          <w:szCs w:val="20"/>
+        </w:rPr>
+        <w:t xml:space="preserve"> se debe a que, a veces, demasiado detalle en el prompt puede generar que el modelo tome prioridad de algunos requisitos y no toma otros, dejando al modelo de IA utilizado que tome sus propios criterios para crear/modificar/eliminar c</w:t>
+      </w:r>
+      <w:r>
+        <w:rPr>
+          <w:rFonts w:hint="cs"/>
+          <w:sz w:val="20"/>
+          <w:szCs w:val="20"/>
+        </w:rPr>
+        <w:t>ó</w:t>
+      </w:r>
+      <w:r>
+        <w:rPr>
+          <w:sz w:val="20"/>
+          <w:szCs w:val="20"/>
+        </w:rPr>
+        <w:t>digo.</w:t>
+      </w:r>
     </w:p>
     <w:sectPr>
       <w:pgSz w:w="11906" w:h="16838"/>
@@ -471,6 +1929,119 @@
     </w:lvl>
   </w:abstractNum>
   <w:abstractNum w:abstractNumId="1" w15:restartNumberingAfterBreak="0">
+    <w:nsid w:val="0BC240E8"/>
+    <w:multiLevelType w:val="hybridMultilevel"/>
+    <w:tmpl w:val="81E82A70"/>
+    <w:lvl w:ilvl="0" w:tplc="2C0A000D">
+      <w:start w:val="1"/>
+      <w:numFmt w:val="bullet"/>
+      <w:lvlText w:val=""/>
+      <w:lvlJc w:val="left"/>
+      <w:pPr>
+        <w:ind w:left="1428" w:hanging="360"/>
+      </w:pPr>
+      <w:rPr>
+        <w:rFonts w:ascii="Wingdings" w:hAnsi="Wingdings" w:hint="default"/>
+      </w:rPr>
+    </w:lvl>
+    <w:lvl w:ilvl="1" w:tplc="2C0A0003" w:tentative="1">
+      <w:start w:val="1"/>
+      <w:numFmt w:val="bullet"/>
+      <w:lvlText w:val="o"/>
+      <w:lvlJc w:val="left"/>
+      <w:pPr>
+        <w:ind w:left="2148" w:hanging="360"/>
+      </w:pPr>
+      <w:rPr>
+        <w:rFonts w:ascii="Courier New" w:hAnsi="Courier New" w:cs="Courier New" w:hint="default"/>
+      </w:rPr>
+    </w:lvl>
+    <w:lvl w:ilvl="2" w:tplc="2C0A0005" w:tentative="1">
+      <w:start w:val="1"/>
+      <w:numFmt w:val="bullet"/>
+      <w:lvlText w:val=""/>
+      <w:lvlJc w:val="left"/>
+      <w:pPr>
+        <w:ind w:left="2868" w:hanging="360"/>
+      </w:pPr>
+      <w:rPr>
+        <w:rFonts w:ascii="Wingdings" w:hAnsi="Wingdings" w:hint="default"/>
+      </w:rPr>
+    </w:lvl>
+    <w:lvl w:ilvl="3" w:tplc="2C0A0001" w:tentative="1">
+      <w:start w:val="1"/>
+      <w:numFmt w:val="bullet"/>
+      <w:lvlText w:val=""/>
+      <w:lvlJc w:val="left"/>
+      <w:pPr>
+        <w:ind w:left="3588" w:hanging="360"/>
+      </w:pPr>
+      <w:rPr>
+        <w:rFonts w:ascii="Symbol" w:hAnsi="Symbol" w:hint="default"/>
+      </w:rPr>
+    </w:lvl>
+    <w:lvl w:ilvl="4" w:tplc="2C0A0003" w:tentative="1">
+      <w:start w:val="1"/>
+      <w:numFmt w:val="bullet"/>
+      <w:lvlText w:val="o"/>
+      <w:lvlJc w:val="left"/>
+      <w:pPr>
+        <w:ind w:left="4308" w:hanging="360"/>
+      </w:pPr>
+      <w:rPr>
+        <w:rFonts w:ascii="Courier New" w:hAnsi="Courier New" w:cs="Courier New" w:hint="default"/>
+      </w:rPr>
+    </w:lvl>
+    <w:lvl w:ilvl="5" w:tplc="2C0A0005" w:tentative="1">
+      <w:start w:val="1"/>
+      <w:numFmt w:val="bullet"/>
+      <w:lvlText w:val=""/>
+      <w:lvlJc w:val="left"/>
+      <w:pPr>
+        <w:ind w:left="5028" w:hanging="360"/>
+      </w:pPr>
+      <w:rPr>
+        <w:rFonts w:ascii="Wingdings" w:hAnsi="Wingdings" w:hint="default"/>
+      </w:rPr>
+    </w:lvl>
+    <w:lvl w:ilvl="6" w:tplc="2C0A0001" w:tentative="1">
+      <w:start w:val="1"/>
+      <w:numFmt w:val="bullet"/>
+      <w:lvlText w:val=""/>
+      <w:lvlJc w:val="left"/>
+      <w:pPr>
+        <w:ind w:left="5748" w:hanging="360"/>
+      </w:pPr>
+      <w:rPr>
+        <w:rFonts w:ascii="Symbol" w:hAnsi="Symbol" w:hint="default"/>
+      </w:rPr>
+    </w:lvl>
+    <w:lvl w:ilvl="7" w:tplc="2C0A0003" w:tentative="1">
+      <w:start w:val="1"/>
+      <w:numFmt w:val="bullet"/>
+      <w:lvlText w:val="o"/>
+      <w:lvlJc w:val="left"/>
+      <w:pPr>
+        <w:ind w:left="6468" w:hanging="360"/>
+      </w:pPr>
+      <w:rPr>
+        <w:rFonts w:ascii="Courier New" w:hAnsi="Courier New" w:cs="Courier New" w:hint="default"/>
+      </w:rPr>
+    </w:lvl>
+    <w:lvl w:ilvl="8" w:tplc="2C0A0005" w:tentative="1">
+      <w:start w:val="1"/>
+      <w:numFmt w:val="bullet"/>
+      <w:lvlText w:val=""/>
+      <w:lvlJc w:val="left"/>
+      <w:pPr>
+        <w:ind w:left="7188" w:hanging="360"/>
+      </w:pPr>
+      <w:rPr>
+        <w:rFonts w:ascii="Wingdings" w:hAnsi="Wingdings" w:hint="default"/>
+      </w:rPr>
+    </w:lvl>
+  </w:abstractNum>
+  <w:abstractNum w:abstractNumId="2" w15:restartNumberingAfterBreak="0">
     <w:nsid w:val="135A25B4"/>
     <w:multiLevelType w:val="hybridMultilevel"/>
     <w:tmpl w:val="5DD2A8EE"/>
@@ -583,7 +2154,120 @@
       </w:rPr>
     </w:lvl>
   </w:abstractNum>
-  <w:abstractNum w:abstractNumId="2" w15:restartNumberingAfterBreak="0">
+  <w:abstractNum w:abstractNumId="3" w15:restartNumberingAfterBreak="0">
+    <w:nsid w:val="31776635"/>
+    <w:multiLevelType w:val="hybridMultilevel"/>
+    <w:tmpl w:val="7D34A1C0"/>
+    <w:lvl w:ilvl="0" w:tplc="2C0A000D">
+      <w:start w:val="1"/>
+      <w:numFmt w:val="bullet"/>
+      <w:lvlText w:val=""/>
+      <w:lvlJc w:val="left"/>
+      <w:pPr>
+        <w:ind w:left="1428" w:hanging="360"/>
+      </w:pPr>
+      <w:rPr>
+        <w:rFonts w:ascii="Wingdings" w:hAnsi="Wingdings" w:hint="default"/>
+      </w:rPr>
+    </w:lvl>
+    <w:lvl w:ilvl="1" w:tplc="2C0A0003" w:tentative="1">
+      <w:start w:val="1"/>
+      <w:numFmt w:val="bullet"/>
+      <w:lvlText w:val="o"/>
+      <w:lvlJc w:val="left"/>
+      <w:pPr>
+        <w:ind w:left="2148" w:hanging="360"/>
+      </w:pPr>
+      <w:rPr>
+        <w:rFonts w:ascii="Courier New" w:hAnsi="Courier New" w:cs="Courier New" w:hint="default"/>
+      </w:rPr>
+    </w:lvl>
+    <w:lvl w:ilvl="2" w:tplc="2C0A0005" w:tentative="1">
+      <w:start w:val="1"/>
+      <w:numFmt w:val="bullet"/>
+      <w:lvlText w:val=""/>
+      <w:lvlJc w:val="left"/>
+      <w:pPr>
+        <w:ind w:left="2868" w:hanging="360"/>
+      </w:pPr>
+      <w:rPr>
+        <w:rFonts w:ascii="Wingdings" w:hAnsi="Wingdings" w:hint="default"/>
+      </w:rPr>
+    </w:lvl>
+    <w:lvl w:ilvl="3" w:tplc="2C0A0001" w:tentative="1">
+      <w:start w:val="1"/>
+      <w:numFmt w:val="bullet"/>
+      <w:lvlText w:val=""/>
+      <w:lvlJc w:val="left"/>
+      <w:pPr>
+        <w:ind w:left="3588" w:hanging="360"/>
+      </w:pPr>
+      <w:rPr>
+        <w:rFonts w:ascii="Symbol" w:hAnsi="Symbol" w:hint="default"/>
+      </w:rPr>
+    </w:lvl>
+    <w:lvl w:ilvl="4" w:tplc="2C0A0003" w:tentative="1">
+      <w:start w:val="1"/>
+      <w:numFmt w:val="bullet"/>
+      <w:lvlText w:val="o"/>
+      <w:lvlJc w:val="left"/>
+      <w:pPr>
+        <w:ind w:left="4308" w:hanging="360"/>
+      </w:pPr>
+      <w:rPr>
+        <w:rFonts w:ascii="Courier New" w:hAnsi="Courier New" w:cs="Courier New" w:hint="default"/>
+      </w:rPr>
+    </w:lvl>
+    <w:lvl w:ilvl="5" w:tplc="2C0A0005" w:tentative="1">
+      <w:start w:val="1"/>
+      <w:numFmt w:val="bullet"/>
+      <w:lvlText w:val=""/>
+      <w:lvlJc w:val="left"/>
+      <w:pPr>
+        <w:ind w:left="5028" w:hanging="360"/>
+      </w:pPr>
+      <w:rPr>
+        <w:rFonts w:ascii="Wingdings" w:hAnsi="Wingdings" w:hint="default"/>
+      </w:rPr>
+    </w:lvl>
+    <w:lvl w:ilvl="6" w:tplc="2C0A0001" w:tentative="1">
+      <w:start w:val="1"/>
+      <w:numFmt w:val="bullet"/>
+      <w:lvlText w:val=""/>
+      <w:lvlJc w:val="left"/>
+      <w:pPr>
+        <w:ind w:left="5748" w:hanging="360"/>
+      </w:pPr>
+      <w:rPr>
+        <w:rFonts w:ascii="Symbol" w:hAnsi="Symbol" w:hint="default"/>
+      </w:rPr>
+    </w:lvl>
+    <w:lvl w:ilvl="7" w:tplc="2C0A0003" w:tentative="1">
+      <w:start w:val="1"/>
+      <w:numFmt w:val="bullet"/>
+      <w:lvlText w:val="o"/>
+      <w:lvlJc w:val="left"/>
+      <w:pPr>
+        <w:ind w:left="6468" w:hanging="360"/>
+      </w:pPr>
+      <w:rPr>
+        <w:rFonts w:ascii="Courier New" w:hAnsi="Courier New" w:cs="Courier New" w:hint="default"/>
+      </w:rPr>
+    </w:lvl>
+    <w:lvl w:ilvl="8" w:tplc="2C0A0005" w:tentative="1">
+      <w:start w:val="1"/>
+      <w:numFmt w:val="bullet"/>
+      <w:lvlText w:val=""/>
+      <w:lvlJc w:val="left"/>
+      <w:pPr>
+        <w:ind w:left="7188" w:hanging="360"/>
+      </w:pPr>
+      <w:rPr>
+        <w:rFonts w:ascii="Wingdings" w:hAnsi="Wingdings" w:hint="default"/>
+      </w:rPr>
+    </w:lvl>
+  </w:abstractNum>
+  <w:abstractNum w:abstractNumId="4" w15:restartNumberingAfterBreak="0">
     <w:nsid w:val="408B581B"/>
     <w:multiLevelType w:val="hybridMultilevel"/>
     <w:tmpl w:val="83D32054"/>
@@ -634,10 +2318,10 @@
       <w:lvlJc w:val="left"/>
     </w:lvl>
   </w:abstractNum>
-  <w:abstractNum w:abstractNumId="3" w15:restartNumberingAfterBreak="0">
+  <w:abstractNum w:abstractNumId="5" w15:restartNumberingAfterBreak="0">
     <w:nsid w:val="481502D7"/>
     <w:multiLevelType w:val="hybridMultilevel"/>
-    <w:tmpl w:val="C792BDE8"/>
+    <w:tmpl w:val="9D36CC64"/>
     <w:lvl w:ilvl="0" w:tplc="2C0A0001">
       <w:start w:val="1"/>
       <w:numFmt w:val="bullet"/>
@@ -740,6 +2424,231 @@
       <w:lvlJc w:val="left"/>
       <w:pPr>
         <w:ind w:left="6480" w:hanging="360"/>
+      </w:pPr>
+      <w:rPr>
+        <w:rFonts w:ascii="Wingdings" w:hAnsi="Wingdings" w:hint="default"/>
+      </w:rPr>
+    </w:lvl>
+  </w:abstractNum>
+  <w:abstractNum w:abstractNumId="6" w15:restartNumberingAfterBreak="0">
+    <w:nsid w:val="6CBB04F9"/>
+    <w:multiLevelType w:val="hybridMultilevel"/>
+    <w:tmpl w:val="FCACDBF4"/>
+    <w:lvl w:ilvl="0" w:tplc="F39E7A44">
+      <w:numFmt w:val="bullet"/>
+      <w:lvlText w:val="•"/>
+      <w:lvlJc w:val="left"/>
+      <w:pPr>
+        <w:ind w:left="1776" w:hanging="360"/>
+      </w:pPr>
+      <w:rPr>
+        <w:rFonts w:ascii="Aptos" w:eastAsiaTheme="minorHAnsi" w:hAnsi="Aptos" w:cstheme="minorBidi" w:hint="default"/>
+      </w:rPr>
+    </w:lvl>
+    <w:lvl w:ilvl="1" w:tplc="2C0A0003" w:tentative="1">
+      <w:start w:val="1"/>
+      <w:numFmt w:val="bullet"/>
+      <w:lvlText w:val="o"/>
+      <w:lvlJc w:val="left"/>
+      <w:pPr>
+        <w:ind w:left="2148" w:hanging="360"/>
+      </w:pPr>
+      <w:rPr>
+        <w:rFonts w:ascii="Courier New" w:hAnsi="Courier New" w:cs="Courier New" w:hint="default"/>
+      </w:rPr>
+    </w:lvl>
+    <w:lvl w:ilvl="2" w:tplc="2C0A0005" w:tentative="1">
+      <w:start w:val="1"/>
+      <w:numFmt w:val="bullet"/>
+      <w:lvlText w:val=""/>
+      <w:lvlJc w:val="left"/>
+      <w:pPr>
+        <w:ind w:left="2868" w:hanging="360"/>
+      </w:pPr>
+      <w:rPr>
+        <w:rFonts w:ascii="Wingdings" w:hAnsi="Wingdings" w:hint="default"/>
+      </w:rPr>
+    </w:lvl>
+    <w:lvl w:ilvl="3" w:tplc="2C0A0001" w:tentative="1">
+      <w:start w:val="1"/>
+      <w:numFmt w:val="bullet"/>
+      <w:lvlText w:val=""/>
+      <w:lvlJc w:val="left"/>
+      <w:pPr>
+        <w:ind w:left="3588" w:hanging="360"/>
+      </w:pPr>
+      <w:rPr>
+        <w:rFonts w:ascii="Symbol" w:hAnsi="Symbol" w:hint="default"/>
+      </w:rPr>
+    </w:lvl>
+    <w:lvl w:ilvl="4" w:tplc="2C0A0003" w:tentative="1">
+      <w:start w:val="1"/>
+      <w:numFmt w:val="bullet"/>
+      <w:lvlText w:val="o"/>
+      <w:lvlJc w:val="left"/>
+      <w:pPr>
+        <w:ind w:left="4308" w:hanging="360"/>
+      </w:pPr>
+      <w:rPr>
+        <w:rFonts w:ascii="Courier New" w:hAnsi="Courier New" w:cs="Courier New" w:hint="default"/>
+      </w:rPr>
+    </w:lvl>
+    <w:lvl w:ilvl="5" w:tplc="2C0A0005" w:tentative="1">
+      <w:start w:val="1"/>
+      <w:numFmt w:val="bullet"/>
+      <w:lvlText w:val=""/>
+      <w:lvlJc w:val="left"/>
+      <w:pPr>
+        <w:ind w:left="5028" w:hanging="360"/>
+      </w:pPr>
+      <w:rPr>
+        <w:rFonts w:ascii="Wingdings" w:hAnsi="Wingdings" w:hint="default"/>
+      </w:rPr>
+    </w:lvl>
+    <w:lvl w:ilvl="6" w:tplc="2C0A0001" w:tentative="1">
+      <w:start w:val="1"/>
+      <w:numFmt w:val="bullet"/>
+      <w:lvlText w:val=""/>
+      <w:lvlJc w:val="left"/>
+      <w:pPr>
+        <w:ind w:left="5748" w:hanging="360"/>
+      </w:pPr>
+      <w:rPr>
+        <w:rFonts w:ascii="Symbol" w:hAnsi="Symbol" w:hint="default"/>
+      </w:rPr>
+    </w:lvl>
+    <w:lvl w:ilvl="7" w:tplc="2C0A0003" w:tentative="1">
+      <w:start w:val="1"/>
+      <w:numFmt w:val="bullet"/>
+      <w:lvlText w:val="o"/>
+      <w:lvlJc w:val="left"/>
+      <w:pPr>
+        <w:ind w:left="6468" w:hanging="360"/>
+      </w:pPr>
+      <w:rPr>
+        <w:rFonts w:ascii="Courier New" w:hAnsi="Courier New" w:cs="Courier New" w:hint="default"/>
+      </w:rPr>
+    </w:lvl>
+    <w:lvl w:ilvl="8" w:tplc="2C0A0005" w:tentative="1">
+      <w:start w:val="1"/>
+      <w:numFmt w:val="bullet"/>
+      <w:lvlText w:val=""/>
+      <w:lvlJc w:val="left"/>
+      <w:pPr>
+        <w:ind w:left="7188" w:hanging="360"/>
+      </w:pPr>
+      <w:rPr>
+        <w:rFonts w:ascii="Wingdings" w:hAnsi="Wingdings" w:hint="default"/>
+      </w:rPr>
+    </w:lvl>
+  </w:abstractNum>
+  <w:abstractNum w:abstractNumId="7" w15:restartNumberingAfterBreak="0">
+    <w:nsid w:val="75243205"/>
+    <w:multiLevelType w:val="hybridMultilevel"/>
+    <w:tmpl w:val="E9564F42"/>
+    <w:lvl w:ilvl="0" w:tplc="2C0A000D">
+      <w:start w:val="1"/>
+      <w:numFmt w:val="bullet"/>
+      <w:lvlText w:val=""/>
+      <w:lvlJc w:val="left"/>
+      <w:pPr>
+        <w:ind w:left="1068" w:hanging="360"/>
+      </w:pPr>
+      <w:rPr>
+        <w:rFonts w:ascii="Wingdings" w:hAnsi="Wingdings" w:hint="default"/>
+      </w:rPr>
+    </w:lvl>
+    <w:lvl w:ilvl="1" w:tplc="2C0A0003" w:tentative="1">
+      <w:start w:val="1"/>
+      <w:numFmt w:val="bullet"/>
+      <w:lvlText w:val="o"/>
+      <w:lvlJc w:val="left"/>
+      <w:pPr>
+        <w:ind w:left="1788" w:hanging="360"/>
+      </w:pPr>
+      <w:rPr>
+        <w:rFonts w:ascii="Courier New" w:hAnsi="Courier New" w:cs="Courier New" w:hint="default"/>
+      </w:rPr>
+    </w:lvl>
+    <w:lvl w:ilvl="2" w:tplc="2C0A0005" w:tentative="1">
+      <w:start w:val="1"/>
+      <w:numFmt w:val="bullet"/>
+      <w:lvlText w:val=""/>
+      <w:lvlJc w:val="left"/>
+      <w:pPr>
+        <w:ind w:left="2508" w:hanging="360"/>
+      </w:pPr>
+      <w:rPr>
+        <w:rFonts w:ascii="Wingdings" w:hAnsi="Wingdings" w:hint="default"/>
+      </w:rPr>
+    </w:lvl>
+    <w:lvl w:ilvl="3" w:tplc="2C0A0001" w:tentative="1">
+      <w:start w:val="1"/>
+      <w:numFmt w:val="bullet"/>
+      <w:lvlText w:val=""/>
+      <w:lvlJc w:val="left"/>
+      <w:pPr>
+        <w:ind w:left="3228" w:hanging="360"/>
+      </w:pPr>
+      <w:rPr>
+        <w:rFonts w:ascii="Symbol" w:hAnsi="Symbol" w:hint="default"/>
+      </w:rPr>
+    </w:lvl>
+    <w:lvl w:ilvl="4" w:tplc="2C0A0003" w:tentative="1">
+      <w:start w:val="1"/>
+      <w:numFmt w:val="bullet"/>
+      <w:lvlText w:val="o"/>
+      <w:lvlJc w:val="left"/>
+      <w:pPr>
+        <w:ind w:left="3948" w:hanging="360"/>
+      </w:pPr>
+      <w:rPr>
+        <w:rFonts w:ascii="Courier New" w:hAnsi="Courier New" w:cs="Courier New" w:hint="default"/>
+      </w:rPr>
+    </w:lvl>
+    <w:lvl w:ilvl="5" w:tplc="2C0A0005" w:tentative="1">
+      <w:start w:val="1"/>
+      <w:numFmt w:val="bullet"/>
+      <w:lvlText w:val=""/>
+      <w:lvlJc w:val="left"/>
+      <w:pPr>
+        <w:ind w:left="4668" w:hanging="360"/>
+      </w:pPr>
+      <w:rPr>
+        <w:rFonts w:ascii="Wingdings" w:hAnsi="Wingdings" w:hint="default"/>
+      </w:rPr>
+    </w:lvl>
+    <w:lvl w:ilvl="6" w:tplc="2C0A0001" w:tentative="1">
+      <w:start w:val="1"/>
+      <w:numFmt w:val="bullet"/>
+      <w:lvlText w:val=""/>
+      <w:lvlJc w:val="left"/>
+      <w:pPr>
+        <w:ind w:left="5388" w:hanging="360"/>
+      </w:pPr>
+      <w:rPr>
+        <w:rFonts w:ascii="Symbol" w:hAnsi="Symbol" w:hint="default"/>
+      </w:rPr>
+    </w:lvl>
+    <w:lvl w:ilvl="7" w:tplc="2C0A0003" w:tentative="1">
+      <w:start w:val="1"/>
+      <w:numFmt w:val="bullet"/>
+      <w:lvlText w:val="o"/>
+      <w:lvlJc w:val="left"/>
+      <w:pPr>
+        <w:ind w:left="6108" w:hanging="360"/>
+      </w:pPr>
+      <w:rPr>
+        <w:rFonts w:ascii="Courier New" w:hAnsi="Courier New" w:cs="Courier New" w:hint="default"/>
+      </w:rPr>
+    </w:lvl>
+    <w:lvl w:ilvl="8" w:tplc="2C0A0005" w:tentative="1">
+      <w:start w:val="1"/>
+      <w:numFmt w:val="bullet"/>
+      <w:lvlText w:val=""/>
+      <w:lvlJc w:val="left"/>
+      <w:pPr>
+        <w:ind w:left="6828" w:hanging="360"/>
       </w:pPr>
       <w:rPr>
         <w:rFonts w:ascii="Wingdings" w:hAnsi="Wingdings" w:hint="default"/>
@@ -747,16 +2656,28 @@
     </w:lvl>
   </w:abstractNum>
   <w:num w:numId="1">
-    <w:abstractNumId w:val="3"/>
+    <w:abstractNumId w:val="5"/>
   </w:num>
   <w:num w:numId="2">
     <w:abstractNumId w:val="0"/>
   </w:num>
   <w:num w:numId="3">
+    <w:abstractNumId w:val="4"/>
+  </w:num>
+  <w:num w:numId="4">
     <w:abstractNumId w:val="2"/>
   </w:num>
-  <w:num w:numId="4">
+  <w:num w:numId="5">
+    <w:abstractNumId w:val="7"/>
+  </w:num>
+  <w:num w:numId="6">
+    <w:abstractNumId w:val="6"/>
+  </w:num>
+  <w:num w:numId="7">
     <w:abstractNumId w:val="1"/>
+  </w:num>
+  <w:num w:numId="8">
+    <w:abstractNumId w:val="3"/>
   </w:num>
 </w:numbering>
 </file>

</xml_diff>